<commit_message>
docs: include diagrams and page numbers in report docx
</commit_message>
<xml_diff>
--- a/documentation/Report writting/ESL Group 4 Report.docx
+++ b/documentation/Report writting/ESL Group 4 Report.docx
@@ -75,7 +75,6 @@
             </w:pPr>
             <w:r>
               <w:rPr>
-                <w:rFonts w:ascii="Times New Roman" w:hAnsi="Times New Roman"/>
                 <w:sz w:val="22"/>
               </w:rPr>
               <w:t>• Umme Hani Punam</w:t>
@@ -94,7 +93,6 @@
             </w:pPr>
             <w:r>
               <w:rPr>
-                <w:rFonts w:ascii="Times New Roman" w:hAnsi="Times New Roman"/>
                 <w:sz w:val="22"/>
               </w:rPr>
               <w:t>• Abu Sayed</w:t>
@@ -115,7 +113,6 @@
             </w:pPr>
             <w:r>
               <w:rPr>
-                <w:rFonts w:ascii="Times New Roman" w:hAnsi="Times New Roman"/>
                 <w:sz w:val="22"/>
               </w:rPr>
               <w:t>• Nusair Ahmed Chowdhury</w:t>
@@ -134,7 +131,6 @@
             </w:pPr>
             <w:r>
               <w:rPr>
-                <w:rFonts w:ascii="Times New Roman" w:hAnsi="Times New Roman"/>
                 <w:sz w:val="22"/>
               </w:rPr>
               <w:t>• Ajwad Mohtasim</w:t>
@@ -155,7 +151,6 @@
             </w:pPr>
             <w:r>
               <w:rPr>
-                <w:rFonts w:ascii="Times New Roman" w:hAnsi="Times New Roman"/>
                 <w:sz w:val="22"/>
               </w:rPr>
               <w:t>• Pranabanta Seth Spondon</w:t>
@@ -174,7 +169,6 @@
             </w:pPr>
             <w:r>
               <w:rPr>
-                <w:rFonts w:ascii="Times New Roman" w:hAnsi="Times New Roman"/>
                 <w:sz w:val="22"/>
               </w:rPr>
               <w:t>• Sabbir Hasnat Shaon</w:t>
@@ -195,7 +189,6 @@
             </w:pPr>
             <w:r>
               <w:rPr>
-                <w:rFonts w:ascii="Times New Roman" w:hAnsi="Times New Roman"/>
                 <w:sz w:val="22"/>
               </w:rPr>
               <w:t>• Nafiz Al Anjim Ahmed</w:t>
@@ -214,7 +207,6 @@
             </w:pPr>
             <w:r>
               <w:rPr>
-                <w:rFonts w:ascii="Times New Roman" w:hAnsi="Times New Roman"/>
                 <w:sz w:val="22"/>
               </w:rPr>
               <w:t>• Maruf All Rushafi</w:t>
@@ -269,9 +261,15 @@
       </w:r>
     </w:p>
     <w:p>
-      <w:r>
-        <w:br w:type="page"/>
-      </w:r>
+      <w:pPr>
+        <w:sectPr>
+          <w:footerReference w:type="default" r:id="rId9"/>
+          <w:pgSz w:w="12240" w:h="15840"/>
+          <w:pgMar w:top="1440" w:right="1440" w:bottom="1440" w:left="1440" w:header="720" w:footer="720" w:gutter="0"/>
+          <w:cols w:space="720"/>
+          <w:docGrid w:linePitch="360"/>
+        </w:sectPr>
+      </w:pPr>
     </w:p>
     <w:p>
       <w:pPr>
@@ -298,7 +296,7 @@
     </w:p>
     <w:p>
       <w:pPr>
-        <w:spacing w:before="960"/>
+        <w:spacing w:before="720"/>
       </w:pPr>
       <w:r>
         <w:rPr>
@@ -326,7 +324,7 @@
           </w:tcPr>
           <w:p>
             <w:pPr>
-              <w:spacing w:before="480"/>
+              <w:spacing w:before="360"/>
             </w:pPr>
             <w:r>
               <w:rPr>
@@ -349,7 +347,7 @@
           </w:tcPr>
           <w:p>
             <w:pPr>
-              <w:spacing w:before="480"/>
+              <w:spacing w:before="360"/>
             </w:pPr>
             <w:r>
               <w:rPr>
@@ -374,7 +372,7 @@
           </w:tcPr>
           <w:p>
             <w:pPr>
-              <w:spacing w:before="480"/>
+              <w:spacing w:before="360"/>
             </w:pPr>
             <w:r>
               <w:rPr>
@@ -397,7 +395,7 @@
           </w:tcPr>
           <w:p>
             <w:pPr>
-              <w:spacing w:before="480"/>
+              <w:spacing w:before="360"/>
             </w:pPr>
             <w:r>
               <w:rPr>
@@ -422,7 +420,7 @@
           </w:tcPr>
           <w:p>
             <w:pPr>
-              <w:spacing w:before="480"/>
+              <w:spacing w:before="360"/>
             </w:pPr>
             <w:r>
               <w:rPr>
@@ -445,7 +443,7 @@
           </w:tcPr>
           <w:p>
             <w:pPr>
-              <w:spacing w:before="480"/>
+              <w:spacing w:before="360"/>
             </w:pPr>
             <w:r>
               <w:rPr>
@@ -470,7 +468,7 @@
           </w:tcPr>
           <w:p>
             <w:pPr>
-              <w:spacing w:before="480"/>
+              <w:spacing w:before="360"/>
             </w:pPr>
             <w:r>
               <w:rPr>
@@ -493,7 +491,7 @@
           </w:tcPr>
           <w:p>
             <w:pPr>
-              <w:spacing w:before="480"/>
+              <w:spacing w:before="360"/>
             </w:pPr>
             <w:r>
               <w:rPr>
@@ -1596,9 +1594,16 @@
       </w:r>
     </w:p>
     <w:p>
-      <w:r>
-        <w:br w:type="page"/>
-      </w:r>
+      <w:pPr>
+        <w:sectPr>
+          <w:footerReference w:type="default" r:id="rId10"/>
+          <w:pgSz w:w="12240" w:h="15840"/>
+          <w:pgMar w:top="1440" w:right="1440" w:bottom="1440" w:left="1440" w:header="720" w:footer="720" w:gutter="0"/>
+          <w:cols w:space="720"/>
+          <w:docGrid w:linePitch="360"/>
+          <w:pgNumType w:fmt="romanLower" w:start="1"/>
+        </w:sectPr>
+      </w:pPr>
     </w:p>
     <w:p>
       <w:pPr>
@@ -1834,6 +1839,57 @@
     <w:p>
       <w:r>
         <w:t>The project was engineered as a modular, software-driven environmental analysis platform. The backend processing pipeline is constructed entirely in Python, utilizing the Pandas library for robust CSV data ingestion and matrix manipulation. Core physical calculations are strictly encapsulated within dedicated modules, ensuring mathematical accuracy. The predictive engine leverages Scikit-Learn to train regression models, while spatial visualization is handled by Folium and Leaflet.js, producing interactive, glassmorphic HTML dashboards.</w:t>
+      </w:r>
+    </w:p>
+    <w:p>
+      <w:pPr>
+        <w:jc w:val="center"/>
+      </w:pPr>
+      <w:r>
+        <w:drawing>
+          <wp:inline xmlns:a="http://schemas.openxmlformats.org/drawingml/2006/main" xmlns:pic="http://schemas.openxmlformats.org/drawingml/2006/picture">
+            <wp:extent cx="4572000" cy="4572000"/>
+            <wp:docPr id="1" name="Picture 1"/>
+            <wp:cNvGraphicFramePr>
+              <a:graphicFrameLocks noChangeAspect="1"/>
+            </wp:cNvGraphicFramePr>
+            <a:graphic>
+              <a:graphicData uri="http://schemas.openxmlformats.org/drawingml/2006/picture">
+                <pic:pic>
+                  <pic:nvPicPr>
+                    <pic:cNvPr id="0" name="system_architecture.png"/>
+                    <pic:cNvPicPr/>
+                  </pic:nvPicPr>
+                  <pic:blipFill>
+                    <a:blip r:embed="rId12"/>
+                    <a:stretch>
+                      <a:fillRect/>
+                    </a:stretch>
+                  </pic:blipFill>
+                  <pic:spPr>
+                    <a:xfrm>
+                      <a:off x="0" y="0"/>
+                      <a:ext cx="4572000" cy="4572000"/>
+                    </a:xfrm>
+                    <a:prstGeom prst="rect"/>
+                  </pic:spPr>
+                </pic:pic>
+              </a:graphicData>
+            </a:graphic>
+          </wp:inline>
+        </w:drawing>
+      </w:r>
+    </w:p>
+    <w:p>
+      <w:pPr>
+        <w:spacing w:after="240"/>
+        <w:jc w:val="center"/>
+      </w:pPr>
+      <w:r>
+        <w:rPr>
+          <w:i/>
+        </w:rPr>
+        <w:t>Figure 3.1: Modular UHI GIS Pipeline System Architecture</w:t>
       </w:r>
     </w:p>
     <w:p>
@@ -2944,6 +3000,57 @@
     </w:tbl>
     <w:p>
       <w:pPr>
+        <w:jc w:val="center"/>
+      </w:pPr>
+      <w:r>
+        <w:drawing>
+          <wp:inline xmlns:a="http://schemas.openxmlformats.org/drawingml/2006/main" xmlns:pic="http://schemas.openxmlformats.org/drawingml/2006/picture">
+            <wp:extent cx="4114800" cy="2571750"/>
+            <wp:docPr id="2" name="Picture 2"/>
+            <wp:cNvGraphicFramePr>
+              <a:graphicFrameLocks noChangeAspect="1"/>
+            </wp:cNvGraphicFramePr>
+            <a:graphic>
+              <a:graphicData uri="http://schemas.openxmlformats.org/drawingml/2006/picture">
+                <pic:pic>
+                  <pic:nvPicPr>
+                    <pic:cNvPr id="0" name="mirpur12_concrete_vs_veg_scatter.png"/>
+                    <pic:cNvPicPr/>
+                  </pic:nvPicPr>
+                  <pic:blipFill>
+                    <a:blip r:embed="rId13"/>
+                    <a:stretch>
+                      <a:fillRect/>
+                    </a:stretch>
+                  </pic:blipFill>
+                  <pic:spPr>
+                    <a:xfrm>
+                      <a:off x="0" y="0"/>
+                      <a:ext cx="4114800" cy="2571750"/>
+                    </a:xfrm>
+                    <a:prstGeom prst="rect"/>
+                  </pic:spPr>
+                </pic:pic>
+              </a:graphicData>
+            </a:graphic>
+          </wp:inline>
+        </w:drawing>
+      </w:r>
+    </w:p>
+    <w:p>
+      <w:pPr>
+        <w:spacing w:after="240"/>
+        <w:jc w:val="center"/>
+      </w:pPr>
+      <w:r>
+        <w:rPr>
+          <w:i/>
+        </w:rPr>
+        <w:t>Figure 4.2: Inverse Correlation Scatter Plot (LST vs NDVI) for Mirpur 12</w:t>
+      </w:r>
+    </w:p>
+    <w:p>
+      <w:pPr>
         <w:pStyle w:val="Heading2"/>
         <w:keepNext/>
         <w:spacing w:before="240" w:after="120"/>
@@ -3022,6 +3129,57 @@
       </w:r>
       <w:r>
         <w:t>Utilizing the ensemble tree-based models, the system projected regional heat index escalation trajectories leading up to the year 2030. The forecasts revealed an accelerating disparity, with concrete hubs predicted to breach catastrophic thermal limits while vegetated sinks maintain a relatively stable, livable baseline.</w:t>
+      </w:r>
+    </w:p>
+    <w:p>
+      <w:pPr>
+        <w:jc w:val="center"/>
+      </w:pPr>
+      <w:r>
+        <w:drawing>
+          <wp:inline xmlns:a="http://schemas.openxmlformats.org/drawingml/2006/main" xmlns:pic="http://schemas.openxmlformats.org/drawingml/2006/picture">
+            <wp:extent cx="4114800" cy="5878286"/>
+            <wp:docPr id="3" name="Picture 3"/>
+            <wp:cNvGraphicFramePr>
+              <a:graphicFrameLocks noChangeAspect="1"/>
+            </wp:cNvGraphicFramePr>
+            <a:graphic>
+              <a:graphicData uri="http://schemas.openxmlformats.org/drawingml/2006/picture">
+                <pic:pic>
+                  <pic:nvPicPr>
+                    <pic:cNvPr id="0" name="longitudinal_thermal_profile.png"/>
+                    <pic:cNvPicPr/>
+                  </pic:nvPicPr>
+                  <pic:blipFill>
+                    <a:blip r:embed="rId14"/>
+                    <a:stretch>
+                      <a:fillRect/>
+                    </a:stretch>
+                  </pic:blipFill>
+                  <pic:spPr>
+                    <a:xfrm>
+                      <a:off x="0" y="0"/>
+                      <a:ext cx="4114800" cy="5878286"/>
+                    </a:xfrm>
+                    <a:prstGeom prst="rect"/>
+                  </pic:spPr>
+                </pic:pic>
+              </a:graphicData>
+            </a:graphic>
+          </wp:inline>
+        </w:drawing>
+      </w:r>
+    </w:p>
+    <w:p>
+      <w:pPr>
+        <w:spacing w:after="240"/>
+        <w:jc w:val="center"/>
+      </w:pPr>
+      <w:r>
+        <w:rPr>
+          <w:i/>
+        </w:rPr>
+        <w:t>Figure 4.3: Decadal Hybrid Temperature Projection Timeline up to 2030</w:t>
       </w:r>
     </w:p>
     <w:p>
@@ -3389,13 +3547,68 @@
       </w:r>
     </w:p>
     <w:sectPr>
+      <w:footerReference w:type="default" r:id="rId11"/>
       <w:pgSz w:w="12240" w:h="15840"/>
       <w:pgMar w:top="1440" w:right="1440" w:bottom="1440" w:left="1440" w:header="720" w:footer="720" w:gutter="0"/>
       <w:cols w:space="720"/>
       <w:docGrid w:linePitch="360"/>
+      <w:pgNumType w:fmt="romanLower" w:start="1"/>
+      <w:pgNumType w:fmt="decimal" w:start="1"/>
     </w:sectPr>
   </w:body>
 </w:document>
+</file>
+
+<file path=word/footer1.xml><?xml version="1.0" encoding="utf-8"?>
+<w:ftr xmlns:m="http://schemas.openxmlformats.org/officeDocument/2006/math" xmlns:mc="http://schemas.openxmlformats.org/markup-compatibility/2006" xmlns:mo="http://schemas.microsoft.com/office/mac/office/2008/main" xmlns:mv="urn:schemas-microsoft-com:mac:vml" xmlns:o="urn:schemas-microsoft-com:office:office" xmlns:r="http://schemas.openxmlformats.org/officeDocument/2006/relationships" xmlns:v="urn:schemas-microsoft-com:vml" xmlns:w10="urn:schemas-microsoft-com:office:word" xmlns:w14="http://schemas.microsoft.com/office/word/2010/wordml" xmlns:w="http://schemas.openxmlformats.org/wordprocessingml/2006/main" xmlns:wne="http://schemas.microsoft.com/office/word/2006/wordml" xmlns:wp14="http://schemas.microsoft.com/office/word/2010/wordprocessingDrawing" xmlns:wp="http://schemas.openxmlformats.org/drawingml/2006/wordprocessingDrawing" xmlns:wpc="http://schemas.microsoft.com/office/word/2010/wordprocessingCanvas" xmlns:wpg="http://schemas.microsoft.com/office/word/2010/wordprocessingGroup" xmlns:wpi="http://schemas.microsoft.com/office/word/2010/wordprocessingInk" xmlns:wps="http://schemas.microsoft.com/office/word/2010/wordprocessingShape" mc:Ignorable="w14 wp14">
+  <w:p>
+    <w:pPr>
+      <w:pStyle w:val="Footer"/>
+    </w:pPr>
+  </w:p>
+</w:ftr>
+</file>
+
+<file path=word/footer2.xml><?xml version="1.0" encoding="utf-8"?>
+<w:ftr xmlns:m="http://schemas.openxmlformats.org/officeDocument/2006/math" xmlns:mc="http://schemas.openxmlformats.org/markup-compatibility/2006" xmlns:mo="http://schemas.microsoft.com/office/mac/office/2008/main" xmlns:mv="urn:schemas-microsoft-com:mac:vml" xmlns:o="urn:schemas-microsoft-com:office:office" xmlns:r="http://schemas.openxmlformats.org/officeDocument/2006/relationships" xmlns:v="urn:schemas-microsoft-com:vml" xmlns:w10="urn:schemas-microsoft-com:office:word" xmlns:w14="http://schemas.microsoft.com/office/word/2010/wordml" xmlns:w="http://schemas.openxmlformats.org/wordprocessingml/2006/main" xmlns:wne="http://schemas.microsoft.com/office/word/2006/wordml" xmlns:wp14="http://schemas.microsoft.com/office/word/2010/wordprocessingDrawing" xmlns:wp="http://schemas.openxmlformats.org/drawingml/2006/wordprocessingDrawing" xmlns:wpc="http://schemas.microsoft.com/office/word/2010/wordprocessingCanvas" xmlns:wpg="http://schemas.microsoft.com/office/word/2010/wordprocessingGroup" xmlns:wpi="http://schemas.microsoft.com/office/word/2010/wordprocessingInk" xmlns:wps="http://schemas.microsoft.com/office/word/2010/wordprocessingShape" mc:Ignorable="w14 wp14">
+  <w:p>
+    <w:pPr>
+      <w:pStyle w:val="Footer"/>
+      <w:jc w:val="center"/>
+    </w:pPr>
+    <w:r>
+      <w:rPr>
+        <w:rFonts w:ascii="Times New Roman" w:hAnsi="Times New Roman"/>
+        <w:sz w:val="20"/>
+      </w:rPr>
+      <w:fldChar w:fldCharType="begin"/>
+      <w:instrText xml:space="preserve">PAGE</w:instrText>
+      <w:fldChar w:fldCharType="separate"/>
+      <w:fldChar w:fldCharType="end"/>
+    </w:r>
+  </w:p>
+</w:ftr>
+</file>
+
+<file path=word/footer3.xml><?xml version="1.0" encoding="utf-8"?>
+<w:ftr xmlns:m="http://schemas.openxmlformats.org/officeDocument/2006/math" xmlns:mc="http://schemas.openxmlformats.org/markup-compatibility/2006" xmlns:mo="http://schemas.microsoft.com/office/mac/office/2008/main" xmlns:mv="urn:schemas-microsoft-com:mac:vml" xmlns:o="urn:schemas-microsoft-com:office:office" xmlns:r="http://schemas.openxmlformats.org/officeDocument/2006/relationships" xmlns:v="urn:schemas-microsoft-com:vml" xmlns:w10="urn:schemas-microsoft-com:office:word" xmlns:w14="http://schemas.microsoft.com/office/word/2010/wordml" xmlns:w="http://schemas.openxmlformats.org/wordprocessingml/2006/main" xmlns:wne="http://schemas.microsoft.com/office/word/2006/wordml" xmlns:wp14="http://schemas.microsoft.com/office/word/2010/wordprocessingDrawing" xmlns:wp="http://schemas.openxmlformats.org/drawingml/2006/wordprocessingDrawing" xmlns:wpc="http://schemas.microsoft.com/office/word/2010/wordprocessingCanvas" xmlns:wpg="http://schemas.microsoft.com/office/word/2010/wordprocessingGroup" xmlns:wpi="http://schemas.microsoft.com/office/word/2010/wordprocessingInk" xmlns:wps="http://schemas.microsoft.com/office/word/2010/wordprocessingShape" mc:Ignorable="w14 wp14">
+  <w:p>
+    <w:pPr>
+      <w:pStyle w:val="Footer"/>
+      <w:jc w:val="center"/>
+    </w:pPr>
+    <w:r>
+      <w:rPr>
+        <w:rFonts w:ascii="Times New Roman" w:hAnsi="Times New Roman"/>
+        <w:sz w:val="20"/>
+      </w:rPr>
+      <w:fldChar w:fldCharType="begin"/>
+      <w:instrText xml:space="preserve">PAGE</w:instrText>
+      <w:fldChar w:fldCharType="separate"/>
+      <w:fldChar w:fldCharType="end"/>
+    </w:r>
+  </w:p>
+</w:ftr>
 </file>
 
 <file path=word/numbering.xml><?xml version="1.0" encoding="utf-8"?>

</xml_diff>